<commit_message>
update langfuse scripts and docs
</commit_message>
<xml_diff>
--- a/Guide to Langfuse for OpenFN.docx
+++ b/Guide to Langfuse for OpenFN.docx
@@ -307,7 +307,14 @@
           <w:sz w:val="24"/>
           <w:szCs w:val="24"/>
         </w:rPr>
-        <w:t xml:space="preserve">To check if evaluators are really running see if they have made any recent scores in the scores tab, don’t trust the Status saying Active in the evaluators tab. If you need to reset an evaluator, delete it in the evaluator tab, and then set up a new evaluator and select Use existing, </w:t>
+        <w:t>To check if evaluators are really running see if they have made any recent scores in the scores tab, don’t trust the Status saying Active in the evaluators tab. If you need to reset an evaluator, delete it in the evaluator tab, and then set up a new evaluator and select Use existin</w:t>
+      </w:r>
+      <w:r>
+        <w:rPr>
+          <w:sz w:val="24"/>
+          <w:szCs w:val="24"/>
+        </w:rPr>
+        <w:t xml:space="preserve">g and make sure to give it the exact same name as before. Then </w:t>
       </w:r>
       <w:r>
         <w:rPr>
@@ -375,6 +382,64 @@
           <w:szCs w:val="24"/>
         </w:rPr>
         <w:t>should run on job_chat, workflow_chat and global_chat. The general openfn quality and workflow quality judges should run on only workflow_chat and global_chat. The code quality judge should only run on job_chat, but in the future you might want to also try it with global_chat although this had some issues with the LLM being able to see attached code.</w:t>
+      </w:r>
+    </w:p>
+    <w:p>
+      <w:pPr>
+        <w:rPr>
+          <w:sz w:val="24"/>
+          <w:szCs w:val="24"/>
+        </w:rPr>
+      </w:pPr>
+      <w:r>
+        <w:rPr>
+          <w:sz w:val="24"/>
+          <w:szCs w:val="24"/>
+        </w:rPr>
+        <w:t>If you want to create a brand</w:t>
+      </w:r>
+      <w:r>
+        <w:rPr>
+          <w:sz w:val="24"/>
+          <w:szCs w:val="24"/>
+        </w:rPr>
+        <w:t>-</w:t>
+      </w:r>
+      <w:r>
+        <w:rPr>
+          <w:sz w:val="24"/>
+          <w:szCs w:val="24"/>
+        </w:rPr>
+        <w:t xml:space="preserve">new evaluator and get it to work with the summariser, then you just need to write a list of issue tags in a txt file (see the examples on github) and then add the name of the evaluator to </w:t>
+      </w:r>
+      <w:r>
+        <w:rPr>
+          <w:sz w:val="24"/>
+          <w:szCs w:val="24"/>
+        </w:rPr>
+        <w:t>FIXED_TAG_EVALUATORS</w:t>
+      </w:r>
+      <w:r>
+        <w:rPr>
+          <w:sz w:val="24"/>
+          <w:szCs w:val="24"/>
+        </w:rPr>
+        <w:t xml:space="preserve"> in the summariser script. The summariser is designed to be easy to update with new evaluators so it should work just fine.</w:t>
+      </w:r>
+    </w:p>
+    <w:p>
+      <w:pPr>
+        <w:rPr>
+          <w:sz w:val="24"/>
+          <w:szCs w:val="24"/>
+        </w:rPr>
+      </w:pPr>
+      <w:r>
+        <w:rPr>
+          <w:sz w:val="24"/>
+          <w:szCs w:val="24"/>
+        </w:rPr>
+        <w:t>On the other hand the annotation queue builders are built specifically for each evaluator so you will need to make a new script for any new evaluators.</w:t>
       </w:r>
     </w:p>
     <w:p>
@@ -786,6 +851,7 @@
         </w:numPr>
       </w:pPr>
       <w:r>
+        <w:lastRenderedPageBreak/>
         <w:t>Can’t really move charts to and from other platforms, e.g. metabase.</w:t>
       </w:r>
       <w:r>
@@ -839,7 +905,6 @@
         </w:numPr>
       </w:pPr>
       <w:r>
-        <w:lastRenderedPageBreak/>
         <w:t xml:space="preserve">A bit tedious to turn evaluators </w:t>
       </w:r>
       <w:r>
@@ -1205,6 +1270,7 @@
         </w:numPr>
       </w:pPr>
       <w:r>
+        <w:lastRenderedPageBreak/>
         <w:t>Trace deletions may take up to 24 hours according to Langfuse</w:t>
       </w:r>
     </w:p>
@@ -3183,7 +3249,6 @@
   <w:style w:type="character" w:default="1" w:styleId="DefaultParagraphFont">
     <w:name w:val="Default Paragraph Font"/>
     <w:uiPriority w:val="1"/>
-    <w:semiHidden/>
     <w:unhideWhenUsed/>
   </w:style>
   <w:style w:type="table" w:default="1" w:styleId="TableNormal">

</xml_diff>

<commit_message>
update Langfuse guide doc
</commit_message>
<xml_diff>
--- a/Guide to Langfuse for OpenFN.docx
+++ b/Guide to Langfuse for OpenFN.docx
@@ -490,6 +490,65 @@
     </w:p>
     <w:p>
       <w:pPr>
+        <w:jc w:val="center"/>
+        <w:rPr>
+          <w:b/>
+          <w:bCs/>
+          <w:sz w:val="24"/>
+          <w:szCs w:val="24"/>
+        </w:rPr>
+      </w:pPr>
+      <w:r>
+        <w:rPr>
+          <w:b/>
+          <w:bCs/>
+          <w:sz w:val="24"/>
+          <w:szCs w:val="24"/>
+        </w:rPr>
+        <w:t>Linking langfuse to metabase</w:t>
+      </w:r>
+    </w:p>
+    <w:p>
+      <w:pPr>
+        <w:rPr>
+          <w:sz w:val="24"/>
+          <w:szCs w:val="24"/>
+        </w:rPr>
+      </w:pPr>
+      <w:r>
+        <w:rPr>
+          <w:sz w:val="24"/>
+          <w:szCs w:val="24"/>
+        </w:rPr>
+        <w:t xml:space="preserve">The easiest way to do this would probably be with a simple csv upload </w:t>
+      </w:r>
+      <w:hyperlink r:id="rId7" w:history="1">
+        <w:r>
+          <w:rPr>
+            <w:rStyle w:val="Hyperlink"/>
+            <w:sz w:val="24"/>
+            <w:szCs w:val="24"/>
+          </w:rPr>
+          <w:t>https://www.metabase.com/product/csv-uploads/</w:t>
+        </w:r>
+      </w:hyperlink>
+      <w:r>
+        <w:rPr>
+          <w:sz w:val="24"/>
+          <w:szCs w:val="24"/>
+        </w:rPr>
+        <w:t xml:space="preserve"> . The summariser script contains code designed to output the issue tags into csv files which could then be uploaded to metabase</w:t>
+      </w:r>
+      <w:r>
+        <w:rPr>
+          <w:sz w:val="24"/>
+          <w:szCs w:val="24"/>
+        </w:rPr>
+        <w:t xml:space="preserve"> although this isn’t currently implemented in the OpenFN workflow version of the summariser.</w:t>
+      </w:r>
+    </w:p>
+    <w:p>
+      <w:pPr>
         <w:rPr>
           <w:b/>
           <w:bCs/>
@@ -752,6 +811,7 @@
         </w:rPr>
       </w:pPr>
       <w:r>
+        <w:lastRenderedPageBreak/>
         <w:t>Can set up automatic slack alerts for when cost, latency or other scores fall outside expected ranges using the Monitors feature.</w:t>
       </w:r>
     </w:p>
@@ -808,7 +868,7 @@
       <w:r>
         <w:t xml:space="preserve"> </w:t>
       </w:r>
-      <w:hyperlink r:id="rId7" w:history="1">
+      <w:hyperlink r:id="rId8" w:history="1">
         <w:r>
           <w:rPr>
             <w:rStyle w:val="Hyperlink"/>
@@ -852,7 +912,6 @@
         </w:numPr>
       </w:pPr>
       <w:r>
-        <w:lastRenderedPageBreak/>
         <w:t xml:space="preserve">Dashboard </w:t>
       </w:r>
       <w:r>
@@ -1213,6 +1272,7 @@
         </w:numPr>
       </w:pPr>
       <w:r>
+        <w:lastRenderedPageBreak/>
         <w:t>What about customer data that is 1</w:t>
       </w:r>
       <w:r>
@@ -1282,7 +1342,6 @@
         </w:numPr>
       </w:pPr>
       <w:r>
-        <w:lastRenderedPageBreak/>
         <w:t>Evaluation scores and comments are not deleted when their associated trace is deleted.</w:t>
       </w:r>
     </w:p>

</xml_diff>